<commit_message>
docs: add jenkins pipeline evidence
</commit_message>
<xml_diff>
--- a/deploy/jenkins/Informe_Jenkins_Layla.docx
+++ b/deploy/jenkins/Informe_Jenkins_Layla.docx
@@ -2331,6 +2331,545 @@
         <w:t>El pipeline integra validacion automatica, construccion de imagenes y despliegue local reproducible. La ruta Vagrant/Puppet/Docker satisface el requisito de ejecutar Layla en servidores Linux locales, mientras que la ruta Kubernetes permite demostrar escalado y despliegue declarativo usando los manifiestos ya existentes del proyecto.</w:t>
       </w:r>
     </w:p>
+    <w:p>
+      <w:r>
+        <w:br w:type="page"/>
+      </w:r>
+    </w:p>
+    <w:p>
+      <w:pPr>
+        <w:pStyle w:val="Heading1"/>
+      </w:pPr>
+      <w:r>
+        <w:rPr>
+          <w:color w:val="1F4E79"/>
+        </w:rPr>
+        <w:t>Anexo: evidencia de ejecucion</w:t>
+      </w:r>
+    </w:p>
+    <w:p>
+      <w:r>
+        <w:rPr>
+          <w:b/>
+        </w:rPr>
+        <w:t xml:space="preserve">Objetivo. </w:t>
+      </w:r>
+      <w:r>
+        <w:t>Este anexo documenta capturas y logs generados para comprobar que las etapas principales del pipeline de Jenkins se ejecutan correctamente: validacion de herramientas, pruebas unitarias, compilacion y validacion de infraestructura.</w:t>
+      </w:r>
+    </w:p>
+    <w:p>
+      <w:r>
+        <w:rPr>
+          <w:b/>
+        </w:rPr>
+        <w:t xml:space="preserve">Nota sobre Jenkins local. </w:t>
+      </w:r>
+      <w:r>
+        <w:t>Durante la captura de evidencia, Jenkins no estaba respondiendo en http://localhost:8080. Por esa razon se conserva una captura especifica de esa verificacion y el resto de evidencias corresponde a los comandos equivalentes que ejecuta el pipeline.</w:t>
+      </w:r>
+    </w:p>
+    <w:tbl>
+      <w:tblPr>
+        <w:tblStyle w:val="TableGrid"/>
+        <w:tblW w:type="auto" w:w="0"/>
+        <w:jc w:val="center"/>
+        <w:tblLook w:firstColumn="1" w:firstRow="1" w:lastColumn="0" w:lastRow="0" w:noHBand="0" w:noVBand="1" w:val="04A0"/>
+      </w:tblPr>
+      <w:tblGrid>
+        <w:gridCol w:w="3120"/>
+        <w:gridCol w:w="3120"/>
+        <w:gridCol w:w="3120"/>
+      </w:tblGrid>
+      <w:tr>
+        <w:tc>
+          <w:tcPr>
+            <w:tcW w:type="dxa" w:w="3120"/>
+          </w:tcPr>
+          <w:p>
+            <w:r>
+              <w:rPr>
+                <w:b/>
+              </w:rPr>
+              <w:t>Evidencia</w:t>
+            </w:r>
+          </w:p>
+        </w:tc>
+        <w:tc>
+          <w:tcPr>
+            <w:tcW w:type="dxa" w:w="3120"/>
+          </w:tcPr>
+          <w:p>
+            <w:r>
+              <w:rPr>
+                <w:b/>
+              </w:rPr>
+              <w:t>Resultado</w:t>
+            </w:r>
+          </w:p>
+        </w:tc>
+        <w:tc>
+          <w:tcPr>
+            <w:tcW w:type="dxa" w:w="3120"/>
+          </w:tcPr>
+          <w:p>
+            <w:r>
+              <w:rPr>
+                <w:b/>
+              </w:rPr>
+              <w:t>Archivo</w:t>
+            </w:r>
+          </w:p>
+        </w:tc>
+      </w:tr>
+      <w:tr>
+        <w:tc>
+          <w:tcPr>
+            <w:tcW w:type="dxa" w:w="3120"/>
+            <w:vAlign w:val="center"/>
+          </w:tcPr>
+          <w:p>
+            <w:r>
+              <w:t>Preflight</w:t>
+            </w:r>
+          </w:p>
+        </w:tc>
+        <w:tc>
+          <w:tcPr>
+            <w:tcW w:type="dxa" w:w="3120"/>
+            <w:vAlign w:val="center"/>
+          </w:tcPr>
+          <w:p>
+            <w:r>
+              <w:t>Herramientas disponibles: .NET, Node, Corepack, Docker, Docker Compose, Vagrant y kubectl.</w:t>
+            </w:r>
+          </w:p>
+        </w:tc>
+        <w:tc>
+          <w:tcPr>
+            <w:tcW w:type="dxa" w:w="3120"/>
+            <w:vAlign w:val="center"/>
+          </w:tcPr>
+          <w:p>
+            <w:r>
+              <w:t>01-preflight-tools.log</w:t>
+            </w:r>
+          </w:p>
+        </w:tc>
+      </w:tr>
+      <w:tr>
+        <w:tc>
+          <w:tcPr>
+            <w:tcW w:type="dxa" w:w="3120"/>
+            <w:vAlign w:val="center"/>
+          </w:tcPr>
+          <w:p>
+            <w:r>
+              <w:t>server-core tests</w:t>
+            </w:r>
+          </w:p>
+        </w:tc>
+        <w:tc>
+          <w:tcPr>
+            <w:tcW w:type="dxa" w:w="3120"/>
+            <w:vAlign w:val="center"/>
+          </w:tcPr>
+          <w:p>
+            <w:r>
+              <w:t>187 pruebas correctas, 0 fallidas.</w:t>
+            </w:r>
+          </w:p>
+        </w:tc>
+        <w:tc>
+          <w:tcPr>
+            <w:tcW w:type="dxa" w:w="3120"/>
+            <w:vAlign w:val="center"/>
+          </w:tcPr>
+          <w:p>
+            <w:r>
+              <w:t>02-server-core-tests.log</w:t>
+            </w:r>
+          </w:p>
+        </w:tc>
+      </w:tr>
+      <w:tr>
+        <w:tc>
+          <w:tcPr>
+            <w:tcW w:type="dxa" w:w="3120"/>
+            <w:vAlign w:val="center"/>
+          </w:tcPr>
+          <w:p>
+            <w:r>
+              <w:t>client-web tests</w:t>
+            </w:r>
+          </w:p>
+        </w:tc>
+        <w:tc>
+          <w:tcPr>
+            <w:tcW w:type="dxa" w:w="3120"/>
+            <w:vAlign w:val="center"/>
+          </w:tcPr>
+          <w:p>
+            <w:r>
+              <w:t>5 pruebas correctas, 0 fallidas.</w:t>
+            </w:r>
+          </w:p>
+        </w:tc>
+        <w:tc>
+          <w:tcPr>
+            <w:tcW w:type="dxa" w:w="3120"/>
+            <w:vAlign w:val="center"/>
+          </w:tcPr>
+          <w:p>
+            <w:r>
+              <w:t>03-client-web-tests.log</w:t>
+            </w:r>
+          </w:p>
+        </w:tc>
+      </w:tr>
+      <w:tr>
+        <w:tc>
+          <w:tcPr>
+            <w:tcW w:type="dxa" w:w="3120"/>
+            <w:vAlign w:val="center"/>
+          </w:tcPr>
+          <w:p>
+            <w:r>
+              <w:t>server-worldbuilding tests</w:t>
+            </w:r>
+          </w:p>
+        </w:tc>
+        <w:tc>
+          <w:tcPr>
+            <w:tcW w:type="dxa" w:w="3120"/>
+            <w:vAlign w:val="center"/>
+          </w:tcPr>
+          <w:p>
+            <w:r>
+              <w:t>131 pruebas correctas, 0 fallidas.</w:t>
+            </w:r>
+          </w:p>
+        </w:tc>
+        <w:tc>
+          <w:tcPr>
+            <w:tcW w:type="dxa" w:w="3120"/>
+            <w:vAlign w:val="center"/>
+          </w:tcPr>
+          <w:p>
+            <w:r>
+              <w:t>04-worldbuilding-tests.log</w:t>
+            </w:r>
+          </w:p>
+        </w:tc>
+      </w:tr>
+      <w:tr>
+        <w:tc>
+          <w:tcPr>
+            <w:tcW w:type="dxa" w:w="3120"/>
+            <w:vAlign w:val="center"/>
+          </w:tcPr>
+          <w:p>
+            <w:r>
+              <w:t>Builds</w:t>
+            </w:r>
+          </w:p>
+        </w:tc>
+        <w:tc>
+          <w:tcPr>
+            <w:tcW w:type="dxa" w:w="3120"/>
+            <w:vAlign w:val="center"/>
+          </w:tcPr>
+          <w:p>
+            <w:r>
+              <w:t>api-gateway, client-web y server-worldbuilding compilan correctamente.</w:t>
+            </w:r>
+          </w:p>
+        </w:tc>
+        <w:tc>
+          <w:tcPr>
+            <w:tcW w:type="dxa" w:w="3120"/>
+            <w:vAlign w:val="center"/>
+          </w:tcPr>
+          <w:p>
+            <w:r>
+              <w:t>05-dotnet-and-ts-builds.log</w:t>
+            </w:r>
+          </w:p>
+        </w:tc>
+      </w:tr>
+      <w:tr>
+        <w:tc>
+          <w:tcPr>
+            <w:tcW w:type="dxa" w:w="3120"/>
+            <w:vAlign w:val="center"/>
+          </w:tcPr>
+          <w:p>
+            <w:r>
+              <w:t>Infraestructura</w:t>
+            </w:r>
+          </w:p>
+        </w:tc>
+        <w:tc>
+          <w:tcPr>
+            <w:tcW w:type="dxa" w:w="3120"/>
+            <w:vAlign w:val="center"/>
+          </w:tcPr>
+          <w:p>
+            <w:r>
+              <w:t>Vagrantfile y configuraciones Docker Compose validas; kubectl disponible.</w:t>
+            </w:r>
+          </w:p>
+        </w:tc>
+        <w:tc>
+          <w:tcPr>
+            <w:tcW w:type="dxa" w:w="3120"/>
+            <w:vAlign w:val="center"/>
+          </w:tcPr>
+          <w:p>
+            <w:r>
+              <w:t>06-infra-validation.log</w:t>
+            </w:r>
+          </w:p>
+        </w:tc>
+      </w:tr>
+    </w:tbl>
+    <w:p/>
+    <w:p>
+      <w:r>
+        <w:rPr>
+          <w:b/>
+        </w:rPr>
+        <w:t>Captura resumen del pipeline</w:t>
+      </w:r>
+    </w:p>
+    <w:p>
+      <w:r>
+        <w:drawing>
+          <wp:inline xmlns:a="http://schemas.openxmlformats.org/drawingml/2006/main" xmlns:pic="http://schemas.openxmlformats.org/drawingml/2006/picture">
+            <wp:extent cx="5943600" cy="2341418"/>
+            <wp:docPr id="1" name="Picture 1"/>
+            <wp:cNvGraphicFramePr>
+              <a:graphicFrameLocks noChangeAspect="1"/>
+            </wp:cNvGraphicFramePr>
+            <a:graphic>
+              <a:graphicData uri="http://schemas.openxmlformats.org/drawingml/2006/picture">
+                <pic:pic>
+                  <pic:nvPicPr>
+                    <pic:cNvPr id="0" name="pipeline-evidence-summary.png"/>
+                    <pic:cNvPicPr/>
+                  </pic:nvPicPr>
+                  <pic:blipFill>
+                    <a:blip r:embed="rId11"/>
+                    <a:stretch>
+                      <a:fillRect/>
+                    </a:stretch>
+                  </pic:blipFill>
+                  <pic:spPr>
+                    <a:xfrm>
+                      <a:off x="0" y="0"/>
+                      <a:ext cx="5943600" cy="2341418"/>
+                    </a:xfrm>
+                    <a:prstGeom prst="rect"/>
+                  </pic:spPr>
+                </pic:pic>
+              </a:graphicData>
+            </a:graphic>
+          </wp:inline>
+        </w:drawing>
+      </w:r>
+    </w:p>
+    <w:p/>
+    <w:p>
+      <w:r>
+        <w:rPr>
+          <w:b/>
+        </w:rPr>
+        <w:t>Pruebas unitarias de server-core</w:t>
+      </w:r>
+    </w:p>
+    <w:p>
+      <w:r>
+        <w:drawing>
+          <wp:inline xmlns:a="http://schemas.openxmlformats.org/drawingml/2006/main" xmlns:pic="http://schemas.openxmlformats.org/drawingml/2006/picture">
+            <wp:extent cx="5943600" cy="1620982"/>
+            <wp:docPr id="2" name="Picture 2"/>
+            <wp:cNvGraphicFramePr>
+              <a:graphicFrameLocks noChangeAspect="1"/>
+            </wp:cNvGraphicFramePr>
+            <a:graphic>
+              <a:graphicData uri="http://schemas.openxmlformats.org/drawingml/2006/picture">
+                <pic:pic>
+                  <pic:nvPicPr>
+                    <pic:cNvPr id="0" name="02-server-core-tests.png"/>
+                    <pic:cNvPicPr/>
+                  </pic:nvPicPr>
+                  <pic:blipFill>
+                    <a:blip r:embed="rId12"/>
+                    <a:stretch>
+                      <a:fillRect/>
+                    </a:stretch>
+                  </pic:blipFill>
+                  <pic:spPr>
+                    <a:xfrm>
+                      <a:off x="0" y="0"/>
+                      <a:ext cx="5943600" cy="1620982"/>
+                    </a:xfrm>
+                    <a:prstGeom prst="rect"/>
+                  </pic:spPr>
+                </pic:pic>
+              </a:graphicData>
+            </a:graphic>
+          </wp:inline>
+        </w:drawing>
+      </w:r>
+    </w:p>
+    <w:p/>
+    <w:p>
+      <w:r>
+        <w:rPr>
+          <w:b/>
+        </w:rPr>
+        <w:t>Pruebas unitarias de client-web</w:t>
+      </w:r>
+    </w:p>
+    <w:p>
+      <w:r>
+        <w:drawing>
+          <wp:inline xmlns:a="http://schemas.openxmlformats.org/drawingml/2006/main" xmlns:pic="http://schemas.openxmlformats.org/drawingml/2006/picture">
+            <wp:extent cx="5943600" cy="1620982"/>
+            <wp:docPr id="3" name="Picture 3"/>
+            <wp:cNvGraphicFramePr>
+              <a:graphicFrameLocks noChangeAspect="1"/>
+            </wp:cNvGraphicFramePr>
+            <a:graphic>
+              <a:graphicData uri="http://schemas.openxmlformats.org/drawingml/2006/picture">
+                <pic:pic>
+                  <pic:nvPicPr>
+                    <pic:cNvPr id="0" name="03-client-web-tests.png"/>
+                    <pic:cNvPicPr/>
+                  </pic:nvPicPr>
+                  <pic:blipFill>
+                    <a:blip r:embed="rId13"/>
+                    <a:stretch>
+                      <a:fillRect/>
+                    </a:stretch>
+                  </pic:blipFill>
+                  <pic:spPr>
+                    <a:xfrm>
+                      <a:off x="0" y="0"/>
+                      <a:ext cx="5943600" cy="1620982"/>
+                    </a:xfrm>
+                    <a:prstGeom prst="rect"/>
+                  </pic:spPr>
+                </pic:pic>
+              </a:graphicData>
+            </a:graphic>
+          </wp:inline>
+        </w:drawing>
+      </w:r>
+    </w:p>
+    <w:p/>
+    <w:p>
+      <w:r>
+        <w:rPr>
+          <w:b/>
+        </w:rPr>
+        <w:t>Pruebas de server-worldbuilding</w:t>
+      </w:r>
+    </w:p>
+    <w:p>
+      <w:r>
+        <w:drawing>
+          <wp:inline xmlns:a="http://schemas.openxmlformats.org/drawingml/2006/main" xmlns:pic="http://schemas.openxmlformats.org/drawingml/2006/picture">
+            <wp:extent cx="5943600" cy="1620982"/>
+            <wp:docPr id="4" name="Picture 4"/>
+            <wp:cNvGraphicFramePr>
+              <a:graphicFrameLocks noChangeAspect="1"/>
+            </wp:cNvGraphicFramePr>
+            <a:graphic>
+              <a:graphicData uri="http://schemas.openxmlformats.org/drawingml/2006/picture">
+                <pic:pic>
+                  <pic:nvPicPr>
+                    <pic:cNvPr id="0" name="04-worldbuilding-tests.png"/>
+                    <pic:cNvPicPr/>
+                  </pic:nvPicPr>
+                  <pic:blipFill>
+                    <a:blip r:embed="rId14"/>
+                    <a:stretch>
+                      <a:fillRect/>
+                    </a:stretch>
+                  </pic:blipFill>
+                  <pic:spPr>
+                    <a:xfrm>
+                      <a:off x="0" y="0"/>
+                      <a:ext cx="5943600" cy="1620982"/>
+                    </a:xfrm>
+                    <a:prstGeom prst="rect"/>
+                  </pic:spPr>
+                </pic:pic>
+              </a:graphicData>
+            </a:graphic>
+          </wp:inline>
+        </w:drawing>
+      </w:r>
+    </w:p>
+    <w:p/>
+    <w:p>
+      <w:r>
+        <w:rPr>
+          <w:b/>
+        </w:rPr>
+        <w:t>Validacion de infraestructura</w:t>
+      </w:r>
+    </w:p>
+    <w:p>
+      <w:r>
+        <w:drawing>
+          <wp:inline xmlns:a="http://schemas.openxmlformats.org/drawingml/2006/main" xmlns:pic="http://schemas.openxmlformats.org/drawingml/2006/picture">
+            <wp:extent cx="5943600" cy="1693026"/>
+            <wp:docPr id="5" name="Picture 5"/>
+            <wp:cNvGraphicFramePr>
+              <a:graphicFrameLocks noChangeAspect="1"/>
+            </wp:cNvGraphicFramePr>
+            <a:graphic>
+              <a:graphicData uri="http://schemas.openxmlformats.org/drawingml/2006/picture">
+                <pic:pic>
+                  <pic:nvPicPr>
+                    <pic:cNvPr id="0" name="06-infra-validation.png"/>
+                    <pic:cNvPicPr/>
+                  </pic:nvPicPr>
+                  <pic:blipFill>
+                    <a:blip r:embed="rId15"/>
+                    <a:stretch>
+                      <a:fillRect/>
+                    </a:stretch>
+                  </pic:blipFill>
+                  <pic:spPr>
+                    <a:xfrm>
+                      <a:off x="0" y="0"/>
+                      <a:ext cx="5943600" cy="1693026"/>
+                    </a:xfrm>
+                    <a:prstGeom prst="rect"/>
+                  </pic:spPr>
+                </pic:pic>
+              </a:graphicData>
+            </a:graphic>
+          </wp:inline>
+        </w:drawing>
+      </w:r>
+    </w:p>
+    <w:p/>
+    <w:p>
+      <w:r>
+        <w:rPr>
+          <w:b/>
+        </w:rPr>
+        <w:t xml:space="preserve">Ubicacion de evidencias. </w:t>
+      </w:r>
+      <w:r>
+        <w:t>Los logs completos y las capturas estan en deploy/jenkins/evidence/.</w:t>
+      </w:r>
+    </w:p>
     <w:sectPr>
       <w:headerReference w:type="default" r:id="rId9"/>
       <w:footerReference w:type="default" r:id="rId10"/>

</xml_diff>